<commit_message>
homework4 doing ,  project2 prepare
</commit_message>
<xml_diff>
--- a/Homework/homework4ljy2.docx
+++ b/Homework/homework4ljy2.docx
@@ -656,13 +656,7 @@
         </w:tc>
       </w:tr>
     </w:tbl>
-    <w:p>
-      <w:pPr>
-        <w:rPr>
-          <w:rFonts w:hint="eastAsia"/>
-        </w:rPr>
-      </w:pPr>
-    </w:p>
+    <w:p/>
     <w:p>
       <w:r>
         <w:rPr>
@@ -695,10 +689,7 @@
         <w:t>E</w:t>
       </w:r>
       <w:r>
-        <w:t xml:space="preserve">=true|a) </w:t>
-      </w:r>
-      <w:r>
-        <w:t>+</w:t>
+        <w:t>=true|a) +</w:t>
       </w:r>
       <w:r>
         <w:rPr>
@@ -716,13 +707,7 @@
         <w:t>E</w:t>
       </w:r>
       <w:r>
-        <w:t xml:space="preserve">=false </w:t>
-      </w:r>
-      <w:r>
-        <w:t xml:space="preserve">|a) </w:t>
-      </w:r>
-      <w:r>
-        <w:t>=</w:t>
+        <w:t>=false |a) =</w:t>
       </w:r>
       <w:r>
         <w:rPr>
@@ -748,13 +733,7 @@
         <w:t>P</w:t>
       </w:r>
       <w:r>
-        <w:t>(B</w:t>
-      </w:r>
-      <w:r>
-        <w:t xml:space="preserve"> = true</w:t>
-      </w:r>
-      <w:r>
-        <w:t>,</w:t>
+        <w:t>(B = true,</w:t>
       </w:r>
       <w:r>
         <w:rPr>
@@ -807,11 +786,6 @@
     </w:p>
     <w:p/>
     <w:p>
-      <w:pPr>
-        <w:rPr>
-          <w:rFonts w:hint="eastAsia"/>
-        </w:rPr>
-      </w:pPr>
       <w:r>
         <w:t>P(</w:t>
       </w:r>
@@ -822,19 +796,10 @@
         <w:t>B</w:t>
       </w:r>
       <w:r>
-        <w:t>,E| a)</w:t>
-      </w:r>
-      <w:r>
-        <w:t xml:space="preserve"> = 0.0008</w:t>
-      </w:r>
-      <w:r>
-        <w:t xml:space="preserve"> != </w:t>
-      </w:r>
-      <w:r>
-        <w:t>P(E|a)</w:t>
-      </w:r>
-      <w:r>
-        <w:t xml:space="preserve"> *</w:t>
+        <w:t>,E| a) = 0.0008</w:t>
+      </w:r>
+      <w:r>
+        <w:t xml:space="preserve"> != P(E|a) *</w:t>
       </w:r>
       <w:r>
         <w:rPr>
@@ -906,10 +871,7 @@
         <w:t xml:space="preserve"> claim that </w:t>
       </w:r>
       <w:r>
-        <w:t xml:space="preserve"> P(Gfather , Gmother , Gchild ) = P</w:t>
-      </w:r>
-      <w:r>
-        <w:t xml:space="preserve">(Gfather )P(Gmother )P(Gchild ). Because three node is </w:t>
+        <w:t xml:space="preserve"> P(Gfather , Gmother , Gchild ) = P(Gfather )P(Gmother )P(Gchild ). Because three node is </w:t>
       </w:r>
       <w:r>
         <w:rPr>
@@ -931,41 +893,20 @@
     </w:p>
     <w:p>
       <w:r>
-        <w:t>P(Gfather , Gmother , Gchild )</w:t>
-      </w:r>
-      <w:r>
-        <w:t xml:space="preserve"> = P(Gfather | Gmother,  </w:t>
-      </w:r>
-      <w:r>
-        <w:t>Gchild )</w:t>
+        <w:t>P(Gfather , Gmother , Gchild ) = P(Gfather | Gmother,  Gchild )</w:t>
       </w:r>
       <w:r>
         <w:t xml:space="preserve"> </w:t>
       </w:r>
       <w:r>
-        <w:t>P( Gmother |</w:t>
-      </w:r>
-      <w:r>
-        <w:t>Gchild )</w:t>
-      </w:r>
-      <w:r>
-        <w:t xml:space="preserve"> P(</w:t>
-      </w:r>
-      <w:r>
-        <w:t>Gchild</w:t>
-      </w:r>
-      <w:r>
-        <w:t xml:space="preserve">). </w:t>
+        <w:t xml:space="preserve">P( Gmother |Gchild ) P(Gchild). </w:t>
       </w:r>
       <w:r>
         <w:lastRenderedPageBreak/>
         <w:t>Thus, when</w:t>
       </w:r>
       <w:r>
-        <w:t xml:space="preserve"> t</w:t>
-      </w:r>
-      <w:r>
-        <w:t>hree va</w:t>
+        <w:t xml:space="preserve"> three va</w:t>
       </w:r>
       <w:r>
         <w:t>riable are independent, that is to say, there is no links among them.</w:t>
@@ -990,10 +931,7 @@
         <w:t>=</w:t>
       </w:r>
       <w:r>
-        <w:t>P(Gfather | Gmother,  Gchild )</w:t>
-      </w:r>
-      <w:r>
-        <w:t xml:space="preserve">, </w:t>
+        <w:t xml:space="preserve">P(Gfather | Gmother,  Gchild ), </w:t>
       </w:r>
     </w:p>
     <w:p>
@@ -1010,13 +948,7 @@
         <w:t>=</w:t>
       </w:r>
       <w:r>
-        <w:t xml:space="preserve"> </w:t>
-      </w:r>
-      <w:r>
-        <w:t>P(Gmother )</w:t>
-      </w:r>
-      <w:r>
-        <w:t xml:space="preserve"> </w:t>
+        <w:t xml:space="preserve"> P(Gmother ) </w:t>
       </w:r>
     </w:p>
     <w:p>
@@ -1039,9 +971,6 @@
     <w:p>
       <w:pPr>
         <w:pStyle w:val="2"/>
-        <w:rPr>
-          <w:rFonts w:hint="eastAsia"/>
-        </w:rPr>
       </w:pPr>
       <w:r>
         <w:rPr>
@@ -1116,9 +1045,6 @@
     <w:p>
       <w:pPr>
         <w:pStyle w:val="2"/>
-        <w:rPr>
-          <w:rFonts w:hint="eastAsia"/>
-        </w:rPr>
       </w:pPr>
       <w:r>
         <w:rPr>
@@ -1162,21 +1088,1411 @@
         <w:rPr>
           <w:rFonts w:hint="eastAsia"/>
         </w:rPr>
-        <w:t xml:space="preserve">These two directed edges are not described in the </w:t>
-      </w:r>
-      <w:r>
-        <w:rPr>
-          <w:rFonts w:hint="eastAsia"/>
-        </w:rPr>
-        <w:t>hypothesis</w:t>
+        <w:t>These two directed edges are not described in the hypothesis</w:t>
       </w:r>
       <w:r>
         <w:t>.</w:t>
       </w:r>
     </w:p>
     <w:p>
+      <w:pPr>
+        <w:pStyle w:val="2"/>
+      </w:pPr>
+      <w:r>
+        <w:t>D</w:t>
+      </w:r>
+    </w:p>
+    <w:p>
+      <w:r>
+        <w:rPr>
+          <w:rFonts w:hint="eastAsia"/>
+        </w:rPr>
+        <w:t>CPT</w:t>
+      </w:r>
+      <w:r>
+        <w:t xml:space="preserve">  </w:t>
+      </w:r>
+      <w:r>
+        <w:rPr>
+          <w:rFonts w:hint="eastAsia"/>
+        </w:rPr>
+        <w:t>condition</w:t>
+      </w:r>
+      <w:r>
+        <w:t xml:space="preserve"> </w:t>
+      </w:r>
+      <w:r>
+        <w:rPr>
+          <w:rFonts w:hint="eastAsia"/>
+        </w:rPr>
+        <w:t>possibilities</w:t>
+      </w:r>
+      <w:r>
+        <w:t xml:space="preserve"> </w:t>
+      </w:r>
+      <w:r>
+        <w:rPr>
+          <w:rFonts w:hint="eastAsia"/>
+        </w:rPr>
+        <w:t>table</w:t>
+      </w:r>
+    </w:p>
+    <w:p>
+      <w:r>
+        <w:rPr>
+          <w:rFonts w:hint="eastAsia"/>
+        </w:rPr>
+        <w:t>突变概率 为 m</w:t>
+      </w:r>
+    </w:p>
+    <w:p>
+      <w:pPr>
+        <w:rPr>
+          <w:rFonts w:hint="eastAsia"/>
+        </w:rPr>
+      </w:pPr>
+    </w:p>
+    <w:tbl>
+      <w:tblPr>
+        <w:tblStyle w:val="a4"/>
+        <w:tblW w:w="0" w:type="auto"/>
+        <w:tblLook w:val="04A0" w:firstRow="1" w:lastRow="0" w:firstColumn="1" w:lastColumn="0" w:noHBand="0" w:noVBand="1"/>
+      </w:tblPr>
+      <w:tblGrid>
+        <w:gridCol w:w="2074"/>
+        <w:gridCol w:w="2074"/>
+        <w:gridCol w:w="2074"/>
+        <w:gridCol w:w="2074"/>
+      </w:tblGrid>
+      <w:tr>
+        <w:tc>
+          <w:tcPr>
+            <w:tcW w:w="2074" w:type="dxa"/>
+          </w:tcPr>
+          <w:p>
+            <w:r>
+              <w:rPr>
+                <w:rFonts w:hint="eastAsia"/>
+              </w:rPr>
+              <w:t>G</w:t>
+            </w:r>
+            <w:r>
+              <w:t>mother</w:t>
+            </w:r>
+          </w:p>
+        </w:tc>
+        <w:tc>
+          <w:tcPr>
+            <w:tcW w:w="2074" w:type="dxa"/>
+          </w:tcPr>
+          <w:p>
+            <w:r>
+              <w:rPr>
+                <w:rFonts w:hint="eastAsia"/>
+              </w:rPr>
+              <w:t>G</w:t>
+            </w:r>
+            <w:r>
+              <w:t>father</w:t>
+            </w:r>
+          </w:p>
+        </w:tc>
+        <w:tc>
+          <w:tcPr>
+            <w:tcW w:w="2074" w:type="dxa"/>
+          </w:tcPr>
+          <w:p>
+            <w:r>
+              <w:rPr>
+                <w:rFonts w:hint="eastAsia"/>
+              </w:rPr>
+              <w:t>P</w:t>
+            </w:r>
+            <w:r>
+              <w:t>(</w:t>
+            </w:r>
+            <w:r>
+              <w:rPr>
+                <w:rFonts w:hint="eastAsia"/>
+              </w:rPr>
+              <w:t>Gchild</w:t>
+            </w:r>
+            <w:r>
+              <w:t xml:space="preserve"> =</w:t>
+            </w:r>
+            <w:r>
+              <w:rPr>
+                <w:rFonts w:hint="eastAsia"/>
+              </w:rPr>
+              <w:t>l</w:t>
+            </w:r>
+            <w:r>
+              <w:t xml:space="preserve"> )</w:t>
+            </w:r>
+          </w:p>
+        </w:tc>
+        <w:tc>
+          <w:tcPr>
+            <w:tcW w:w="2074" w:type="dxa"/>
+          </w:tcPr>
+          <w:p>
+            <w:r>
+              <w:rPr>
+                <w:rFonts w:hint="eastAsia"/>
+              </w:rPr>
+              <w:t>P(Gchild</w:t>
+            </w:r>
+            <w:r>
+              <w:t xml:space="preserve"> = </w:t>
+            </w:r>
+            <w:r>
+              <w:rPr>
+                <w:rFonts w:hint="eastAsia"/>
+              </w:rPr>
+              <w:t>r</w:t>
+            </w:r>
+            <w:r>
+              <w:t>)</w:t>
+            </w:r>
+          </w:p>
+        </w:tc>
+      </w:tr>
+      <w:tr>
+        <w:tc>
+          <w:tcPr>
+            <w:tcW w:w="2074" w:type="dxa"/>
+          </w:tcPr>
+          <w:p>
+            <w:r>
+              <w:t>L</w:t>
+            </w:r>
+          </w:p>
+        </w:tc>
+        <w:tc>
+          <w:tcPr>
+            <w:tcW w:w="2074" w:type="dxa"/>
+          </w:tcPr>
+          <w:p>
+            <w:r>
+              <w:t>R</w:t>
+            </w:r>
+          </w:p>
+        </w:tc>
+        <w:tc>
+          <w:tcPr>
+            <w:tcW w:w="2074" w:type="dxa"/>
+          </w:tcPr>
+          <w:p>
+            <w:r>
+              <w:t>0.5</w:t>
+            </w:r>
+          </w:p>
+        </w:tc>
+        <w:tc>
+          <w:tcPr>
+            <w:tcW w:w="2074" w:type="dxa"/>
+          </w:tcPr>
+          <w:p>
+            <w:r>
+              <w:rPr>
+                <w:rFonts w:hint="eastAsia"/>
+              </w:rPr>
+              <w:t>0</w:t>
+            </w:r>
+            <w:r>
+              <w:t>.5</w:t>
+            </w:r>
+          </w:p>
+        </w:tc>
+      </w:tr>
+      <w:tr>
+        <w:tc>
+          <w:tcPr>
+            <w:tcW w:w="2074" w:type="dxa"/>
+          </w:tcPr>
+          <w:p>
+            <w:r>
+              <w:t>L</w:t>
+            </w:r>
+          </w:p>
+        </w:tc>
+        <w:tc>
+          <w:tcPr>
+            <w:tcW w:w="2074" w:type="dxa"/>
+          </w:tcPr>
+          <w:p>
+            <w:r>
+              <w:t>L</w:t>
+            </w:r>
+          </w:p>
+        </w:tc>
+        <w:tc>
+          <w:tcPr>
+            <w:tcW w:w="2074" w:type="dxa"/>
+          </w:tcPr>
+          <w:p>
+            <w:r>
+              <w:rPr>
+                <w:rFonts w:hint="eastAsia"/>
+              </w:rPr>
+              <w:t>1</w:t>
+            </w:r>
+            <w:r>
+              <w:t>-m</w:t>
+            </w:r>
+          </w:p>
+        </w:tc>
+        <w:tc>
+          <w:tcPr>
+            <w:tcW w:w="2074" w:type="dxa"/>
+          </w:tcPr>
+          <w:p>
+            <w:r>
+              <w:t>M</w:t>
+            </w:r>
+          </w:p>
+        </w:tc>
+      </w:tr>
+      <w:tr>
+        <w:tc>
+          <w:tcPr>
+            <w:tcW w:w="2074" w:type="dxa"/>
+          </w:tcPr>
+          <w:p>
+            <w:r>
+              <w:t>R</w:t>
+            </w:r>
+          </w:p>
+        </w:tc>
+        <w:tc>
+          <w:tcPr>
+            <w:tcW w:w="2074" w:type="dxa"/>
+          </w:tcPr>
+          <w:p>
+            <w:r>
+              <w:t>R</w:t>
+            </w:r>
+          </w:p>
+        </w:tc>
+        <w:tc>
+          <w:tcPr>
+            <w:tcW w:w="2074" w:type="dxa"/>
+          </w:tcPr>
+          <w:p>
+            <w:pPr>
+              <w:rPr>
+                <w:rFonts w:hint="eastAsia"/>
+              </w:rPr>
+            </w:pPr>
+            <w:r>
+              <w:rPr>
+                <w:rFonts w:hint="eastAsia"/>
+              </w:rPr>
+              <w:t>m</w:t>
+            </w:r>
+          </w:p>
+        </w:tc>
+        <w:tc>
+          <w:tcPr>
+            <w:tcW w:w="2074" w:type="dxa"/>
+          </w:tcPr>
+          <w:p>
+            <w:r>
+              <w:rPr>
+                <w:rFonts w:hint="eastAsia"/>
+              </w:rPr>
+              <w:t>1</w:t>
+            </w:r>
+            <w:r>
+              <w:t>-</w:t>
+            </w:r>
+            <w:r>
+              <w:t>m</w:t>
+            </w:r>
+          </w:p>
+        </w:tc>
+      </w:tr>
+      <w:tr>
+        <w:tc>
+          <w:tcPr>
+            <w:tcW w:w="2074" w:type="dxa"/>
+          </w:tcPr>
+          <w:p>
+            <w:pPr>
+              <w:rPr>
+                <w:rFonts w:hint="eastAsia"/>
+              </w:rPr>
+            </w:pPr>
+            <w:r>
+              <w:t>R</w:t>
+            </w:r>
+          </w:p>
+        </w:tc>
+        <w:tc>
+          <w:tcPr>
+            <w:tcW w:w="2074" w:type="dxa"/>
+          </w:tcPr>
+          <w:p>
+            <w:pPr>
+              <w:rPr>
+                <w:rFonts w:hint="eastAsia"/>
+              </w:rPr>
+            </w:pPr>
+            <w:r>
+              <w:t>L</w:t>
+            </w:r>
+          </w:p>
+        </w:tc>
+        <w:tc>
+          <w:tcPr>
+            <w:tcW w:w="2074" w:type="dxa"/>
+          </w:tcPr>
+          <w:p>
+            <w:r>
+              <w:rPr>
+                <w:rFonts w:hint="eastAsia"/>
+              </w:rPr>
+              <w:t>0</w:t>
+            </w:r>
+            <w:r>
+              <w:t>.5</w:t>
+            </w:r>
+          </w:p>
+        </w:tc>
+        <w:tc>
+          <w:tcPr>
+            <w:tcW w:w="2074" w:type="dxa"/>
+          </w:tcPr>
+          <w:p>
+            <w:r>
+              <w:rPr>
+                <w:rFonts w:hint="eastAsia"/>
+              </w:rPr>
+              <w:t>0</w:t>
+            </w:r>
+            <w:r>
+              <w:t>.5</w:t>
+            </w:r>
+          </w:p>
+        </w:tc>
+      </w:tr>
+    </w:tbl>
+    <w:p>
+      <w:pPr>
+        <w:rPr>
+          <w:rFonts w:hint="eastAsia"/>
+        </w:rPr>
+      </w:pPr>
+    </w:p>
+    <w:p>
+      <w:pPr>
+        <w:pStyle w:val="2"/>
+      </w:pPr>
+      <w:r>
+        <w:t>E</w:t>
+      </w:r>
+    </w:p>
+    <w:tbl>
+      <w:tblPr>
+        <w:tblStyle w:val="a4"/>
+        <w:tblW w:w="0" w:type="auto"/>
+        <w:tblLook w:val="04A0" w:firstRow="1" w:lastRow="0" w:firstColumn="1" w:lastColumn="0" w:noHBand="0" w:noVBand="1"/>
+      </w:tblPr>
+      <w:tblGrid>
+        <w:gridCol w:w="1727"/>
+        <w:gridCol w:w="1685"/>
+        <w:gridCol w:w="1466"/>
+        <w:gridCol w:w="1709"/>
+        <w:gridCol w:w="1709"/>
+      </w:tblGrid>
+      <w:tr>
+        <w:tc>
+          <w:tcPr>
+            <w:tcW w:w="1727" w:type="dxa"/>
+          </w:tcPr>
+          <w:p>
+            <w:r>
+              <w:rPr>
+                <w:rFonts w:hint="eastAsia"/>
+              </w:rPr>
+              <w:t>G</w:t>
+            </w:r>
+            <w:r>
+              <w:t>mother</w:t>
+            </w:r>
+          </w:p>
+        </w:tc>
+        <w:tc>
+          <w:tcPr>
+            <w:tcW w:w="1685" w:type="dxa"/>
+          </w:tcPr>
+          <w:p>
+            <w:r>
+              <w:rPr>
+                <w:rFonts w:hint="eastAsia"/>
+              </w:rPr>
+              <w:t>G</w:t>
+            </w:r>
+            <w:r>
+              <w:t>father</w:t>
+            </w:r>
+          </w:p>
+        </w:tc>
+        <w:tc>
+          <w:tcPr>
+            <w:tcW w:w="1466" w:type="dxa"/>
+          </w:tcPr>
+          <w:p>
+            <w:pPr>
+              <w:rPr>
+                <w:rFonts w:hint="eastAsia"/>
+              </w:rPr>
+            </w:pPr>
+            <w:r>
+              <w:t>P</w:t>
+            </w:r>
+            <w:r>
+              <w:rPr>
+                <w:rFonts w:hint="eastAsia"/>
+              </w:rPr>
+              <w:t>ossibilities</w:t>
+            </w:r>
+          </w:p>
+        </w:tc>
+        <w:tc>
+          <w:tcPr>
+            <w:tcW w:w="1709" w:type="dxa"/>
+          </w:tcPr>
+          <w:p>
+            <w:r>
+              <w:rPr>
+                <w:rFonts w:hint="eastAsia"/>
+              </w:rPr>
+              <w:t>P</w:t>
+            </w:r>
+            <w:r>
+              <w:t>(</w:t>
+            </w:r>
+            <w:r>
+              <w:rPr>
+                <w:rFonts w:hint="eastAsia"/>
+              </w:rPr>
+              <w:t>Gchild</w:t>
+            </w:r>
+            <w:r>
+              <w:t xml:space="preserve"> =</w:t>
+            </w:r>
+            <w:r>
+              <w:rPr>
+                <w:rFonts w:hint="eastAsia"/>
+              </w:rPr>
+              <w:t>l</w:t>
+            </w:r>
+            <w:r>
+              <w:t xml:space="preserve"> )</w:t>
+            </w:r>
+          </w:p>
+        </w:tc>
+        <w:tc>
+          <w:tcPr>
+            <w:tcW w:w="1709" w:type="dxa"/>
+          </w:tcPr>
+          <w:p>
+            <w:r>
+              <w:rPr>
+                <w:rFonts w:hint="eastAsia"/>
+              </w:rPr>
+              <w:t>P(Gchild</w:t>
+            </w:r>
+            <w:r>
+              <w:t xml:space="preserve"> = </w:t>
+            </w:r>
+            <w:r>
+              <w:rPr>
+                <w:rFonts w:hint="eastAsia"/>
+              </w:rPr>
+              <w:t>r</w:t>
+            </w:r>
+            <w:r>
+              <w:t>)</w:t>
+            </w:r>
+          </w:p>
+        </w:tc>
+      </w:tr>
+      <w:tr>
+        <w:tc>
+          <w:tcPr>
+            <w:tcW w:w="1727" w:type="dxa"/>
+          </w:tcPr>
+          <w:p>
+            <w:r>
+              <w:t>L</w:t>
+            </w:r>
+          </w:p>
+        </w:tc>
+        <w:tc>
+          <w:tcPr>
+            <w:tcW w:w="1685" w:type="dxa"/>
+          </w:tcPr>
+          <w:p>
+            <w:r>
+              <w:t>R</w:t>
+            </w:r>
+          </w:p>
+        </w:tc>
+        <w:tc>
+          <w:tcPr>
+            <w:tcW w:w="1466" w:type="dxa"/>
+          </w:tcPr>
+          <w:p>
+            <w:r>
+              <w:t>Q*(1-</w:t>
+            </w:r>
+            <w:r>
+              <w:rPr>
+                <w:rFonts w:hint="eastAsia"/>
+              </w:rPr>
+              <w:t>q</w:t>
+            </w:r>
+            <w:r>
+              <w:t>)</w:t>
+            </w:r>
+          </w:p>
+        </w:tc>
+        <w:tc>
+          <w:tcPr>
+            <w:tcW w:w="1709" w:type="dxa"/>
+          </w:tcPr>
+          <w:p>
+            <w:r>
+              <w:t>0.5</w:t>
+            </w:r>
+            <w:r>
+              <w:t xml:space="preserve">* </w:t>
+            </w:r>
+            <w:r>
+              <w:t>Q*(1-</w:t>
+            </w:r>
+            <w:r>
+              <w:rPr>
+                <w:rFonts w:hint="eastAsia"/>
+              </w:rPr>
+              <w:t>q</w:t>
+            </w:r>
+            <w:r>
+              <w:t>)</w:t>
+            </w:r>
+          </w:p>
+        </w:tc>
+        <w:tc>
+          <w:tcPr>
+            <w:tcW w:w="1709" w:type="dxa"/>
+          </w:tcPr>
+          <w:p>
+            <w:r>
+              <w:rPr>
+                <w:rFonts w:hint="eastAsia"/>
+              </w:rPr>
+              <w:t>0</w:t>
+            </w:r>
+            <w:r>
+              <w:t>.5</w:t>
+            </w:r>
+          </w:p>
+        </w:tc>
+      </w:tr>
+      <w:tr>
+        <w:tc>
+          <w:tcPr>
+            <w:tcW w:w="1727" w:type="dxa"/>
+          </w:tcPr>
+          <w:p>
+            <w:r>
+              <w:t>L</w:t>
+            </w:r>
+          </w:p>
+        </w:tc>
+        <w:tc>
+          <w:tcPr>
+            <w:tcW w:w="1685" w:type="dxa"/>
+          </w:tcPr>
+          <w:p>
+            <w:r>
+              <w:t>L</w:t>
+            </w:r>
+          </w:p>
+        </w:tc>
+        <w:tc>
+          <w:tcPr>
+            <w:tcW w:w="1466" w:type="dxa"/>
+          </w:tcPr>
+          <w:p>
+            <w:pPr>
+              <w:rPr>
+                <w:rFonts w:hint="eastAsia"/>
+              </w:rPr>
+            </w:pPr>
+            <w:r>
+              <w:t>Q*</w:t>
+            </w:r>
+            <w:r>
+              <w:rPr>
+                <w:rFonts w:hint="eastAsia"/>
+              </w:rPr>
+              <w:t>q</w:t>
+            </w:r>
+          </w:p>
+        </w:tc>
+        <w:tc>
+          <w:tcPr>
+            <w:tcW w:w="1709" w:type="dxa"/>
+          </w:tcPr>
+          <w:p>
+            <w:r>
+              <w:t>(</w:t>
+            </w:r>
+            <w:r>
+              <w:rPr>
+                <w:rFonts w:hint="eastAsia"/>
+              </w:rPr>
+              <w:t>1</w:t>
+            </w:r>
+            <w:r>
+              <w:t>-m</w:t>
+            </w:r>
+            <w:r>
+              <w:t xml:space="preserve">)* </w:t>
+            </w:r>
+            <w:r>
+              <w:t>Q*</w:t>
+            </w:r>
+            <w:r>
+              <w:rPr>
+                <w:rFonts w:hint="eastAsia"/>
+              </w:rPr>
+              <w:t>q</w:t>
+            </w:r>
+          </w:p>
+        </w:tc>
+        <w:tc>
+          <w:tcPr>
+            <w:tcW w:w="1709" w:type="dxa"/>
+          </w:tcPr>
+          <w:p>
+            <w:r>
+              <w:t>M* Q*</w:t>
+            </w:r>
+            <w:r>
+              <w:rPr>
+                <w:rFonts w:hint="eastAsia"/>
+              </w:rPr>
+              <w:t>q</w:t>
+            </w:r>
+          </w:p>
+        </w:tc>
+      </w:tr>
+      <w:tr>
+        <w:tc>
+          <w:tcPr>
+            <w:tcW w:w="1727" w:type="dxa"/>
+          </w:tcPr>
+          <w:p>
+            <w:r>
+              <w:t>R</w:t>
+            </w:r>
+          </w:p>
+        </w:tc>
+        <w:tc>
+          <w:tcPr>
+            <w:tcW w:w="1685" w:type="dxa"/>
+          </w:tcPr>
+          <w:p>
+            <w:r>
+              <w:t>R</w:t>
+            </w:r>
+          </w:p>
+        </w:tc>
+        <w:tc>
+          <w:tcPr>
+            <w:tcW w:w="1466" w:type="dxa"/>
+          </w:tcPr>
+          <w:p>
+            <w:pPr>
+              <w:rPr>
+                <w:rFonts w:hint="eastAsia"/>
+              </w:rPr>
+            </w:pPr>
+            <w:r>
+              <w:t>(1-</w:t>
+            </w:r>
+            <w:r>
+              <w:rPr>
+                <w:rFonts w:hint="eastAsia"/>
+              </w:rPr>
+              <w:t>q</w:t>
+            </w:r>
+            <w:r>
+              <w:t>)*(1-</w:t>
+            </w:r>
+            <w:r>
+              <w:rPr>
+                <w:rFonts w:hint="eastAsia"/>
+              </w:rPr>
+              <w:t>q</w:t>
+            </w:r>
+            <w:r>
+              <w:t>)</w:t>
+            </w:r>
+          </w:p>
+        </w:tc>
+        <w:tc>
+          <w:tcPr>
+            <w:tcW w:w="1709" w:type="dxa"/>
+          </w:tcPr>
+          <w:p>
+            <w:pPr>
+              <w:rPr>
+                <w:rFonts w:hint="eastAsia"/>
+              </w:rPr>
+            </w:pPr>
+            <w:r>
+              <w:t>M*(1-</w:t>
+            </w:r>
+            <w:r>
+              <w:rPr>
+                <w:rFonts w:hint="eastAsia"/>
+              </w:rPr>
+              <w:t>q</w:t>
+            </w:r>
+            <w:r>
+              <w:t>)*(1-</w:t>
+            </w:r>
+            <w:r>
+              <w:rPr>
+                <w:rFonts w:hint="eastAsia"/>
+              </w:rPr>
+              <w:t>q</w:t>
+            </w:r>
+            <w:r>
+              <w:t>)</w:t>
+            </w:r>
+          </w:p>
+        </w:tc>
+        <w:tc>
+          <w:tcPr>
+            <w:tcW w:w="1709" w:type="dxa"/>
+          </w:tcPr>
+          <w:p>
+            <w:r>
+              <w:t>(</w:t>
+            </w:r>
+            <w:r>
+              <w:rPr>
+                <w:rFonts w:hint="eastAsia"/>
+              </w:rPr>
+              <w:t>1</w:t>
+            </w:r>
+            <w:r>
+              <w:t>-m</w:t>
+            </w:r>
+            <w:r>
+              <w:t>) *</w:t>
+            </w:r>
+            <w:r>
+              <w:t>(1-</w:t>
+            </w:r>
+            <w:r>
+              <w:rPr>
+                <w:rFonts w:hint="eastAsia"/>
+              </w:rPr>
+              <w:t>q</w:t>
+            </w:r>
+            <w:r>
+              <w:t>)*(1-</w:t>
+            </w:r>
+            <w:r>
+              <w:rPr>
+                <w:rFonts w:hint="eastAsia"/>
+              </w:rPr>
+              <w:t>q</w:t>
+            </w:r>
+            <w:r>
+              <w:t>)</w:t>
+            </w:r>
+          </w:p>
+        </w:tc>
+      </w:tr>
+      <w:tr>
+        <w:tc>
+          <w:tcPr>
+            <w:tcW w:w="1727" w:type="dxa"/>
+          </w:tcPr>
+          <w:p>
+            <w:pPr>
+              <w:rPr>
+                <w:rFonts w:hint="eastAsia"/>
+              </w:rPr>
+            </w:pPr>
+            <w:r>
+              <w:t>R</w:t>
+            </w:r>
+          </w:p>
+        </w:tc>
+        <w:tc>
+          <w:tcPr>
+            <w:tcW w:w="1685" w:type="dxa"/>
+          </w:tcPr>
+          <w:p>
+            <w:pPr>
+              <w:rPr>
+                <w:rFonts w:hint="eastAsia"/>
+              </w:rPr>
+            </w:pPr>
+            <w:r>
+              <w:t>L</w:t>
+            </w:r>
+          </w:p>
+        </w:tc>
+        <w:tc>
+          <w:tcPr>
+            <w:tcW w:w="1466" w:type="dxa"/>
+          </w:tcPr>
+          <w:p>
+            <w:pPr>
+              <w:rPr>
+                <w:rFonts w:hint="eastAsia"/>
+              </w:rPr>
+            </w:pPr>
+            <w:r>
+              <w:rPr>
+                <w:rFonts w:hint="eastAsia"/>
+              </w:rPr>
+              <w:t>q</w:t>
+            </w:r>
+            <w:r>
+              <w:t>*(1-</w:t>
+            </w:r>
+            <w:r>
+              <w:rPr>
+                <w:rFonts w:hint="eastAsia"/>
+              </w:rPr>
+              <w:t>q</w:t>
+            </w:r>
+            <w:r>
+              <w:t>)</w:t>
+            </w:r>
+          </w:p>
+        </w:tc>
+        <w:tc>
+          <w:tcPr>
+            <w:tcW w:w="1709" w:type="dxa"/>
+          </w:tcPr>
+          <w:p>
+            <w:r>
+              <w:rPr>
+                <w:rFonts w:hint="eastAsia"/>
+              </w:rPr>
+              <w:t>0</w:t>
+            </w:r>
+            <w:r>
+              <w:t>.5</w:t>
+            </w:r>
+            <w:r>
+              <w:t xml:space="preserve">* </w:t>
+            </w:r>
+            <w:r>
+              <w:t>Q*(1-</w:t>
+            </w:r>
+            <w:r>
+              <w:rPr>
+                <w:rFonts w:hint="eastAsia"/>
+              </w:rPr>
+              <w:t>q</w:t>
+            </w:r>
+            <w:r>
+              <w:t>)</w:t>
+            </w:r>
+          </w:p>
+        </w:tc>
+        <w:tc>
+          <w:tcPr>
+            <w:tcW w:w="1709" w:type="dxa"/>
+          </w:tcPr>
+          <w:p>
+            <w:r>
+              <w:rPr>
+                <w:rFonts w:hint="eastAsia"/>
+              </w:rPr>
+              <w:t>0</w:t>
+            </w:r>
+            <w:r>
+              <w:t>.5</w:t>
+            </w:r>
+          </w:p>
+        </w:tc>
+      </w:tr>
+    </w:tbl>
+    <w:p>
+      <w:r>
+        <w:t>(</w:t>
+      </w:r>
+      <w:r>
+        <w:rPr>
+          <w:rFonts w:hint="eastAsia"/>
+        </w:rPr>
+        <w:t>1</w:t>
+      </w:r>
+      <w:r>
+        <w:t>-m)* Q*</w:t>
+      </w:r>
+      <w:r>
+        <w:rPr>
+          <w:rFonts w:hint="eastAsia"/>
+        </w:rPr>
+        <w:t>q</w:t>
+      </w:r>
+      <w:r>
+        <w:t xml:space="preserve"> +</w:t>
+      </w:r>
+      <w:r>
+        <w:t xml:space="preserve"> </w:t>
+      </w:r>
+      <w:r>
+        <w:t>Q*(1-</w:t>
+      </w:r>
+      <w:r>
+        <w:rPr>
+          <w:rFonts w:hint="eastAsia"/>
+        </w:rPr>
+        <w:t>q</w:t>
+      </w:r>
+      <w:r>
+        <w:t>)</w:t>
+      </w:r>
+      <w:r>
+        <w:t xml:space="preserve"> +</w:t>
+      </w:r>
+      <w:r>
+        <w:t xml:space="preserve"> </w:t>
+      </w:r>
+      <w:r>
+        <w:t>M*(1-</w:t>
+      </w:r>
+      <w:r>
+        <w:rPr>
+          <w:rFonts w:hint="eastAsia"/>
+        </w:rPr>
+        <w:t>q</w:t>
+      </w:r>
+      <w:r>
+        <w:t>)*(1-</w:t>
+      </w:r>
+      <w:r>
+        <w:rPr>
+          <w:rFonts w:hint="eastAsia"/>
+        </w:rPr>
+        <w:t>q</w:t>
+      </w:r>
+      <w:r>
+        <w:t>)</w:t>
+      </w:r>
+      <w:r>
+        <w:t xml:space="preserve"> = q^2-mq^2 +q –q^2 +M(1-2q+q*^2)</w:t>
+      </w:r>
+    </w:p>
+    <w:p>
+      <w:r>
+        <w:lastRenderedPageBreak/>
+        <w:t xml:space="preserve">= </w:t>
+      </w:r>
+      <w:r>
+        <w:t>q</w:t>
+      </w:r>
+      <w:r>
+        <w:t>+</w:t>
+      </w:r>
+      <w:r>
+        <w:t>m</w:t>
+      </w:r>
+      <w:r>
+        <w:t>-2</w:t>
+      </w:r>
+      <w:r>
+        <w:t>m</w:t>
+      </w:r>
+      <w:r>
+        <w:t>q</w:t>
+      </w:r>
+    </w:p>
+    <w:p/>
+    <w:p>
+      <w:pPr>
+        <w:pStyle w:val="2"/>
+      </w:pPr>
+      <w:r>
+        <w:t>F</w:t>
+      </w:r>
+    </w:p>
+    <w:p/>
+    <w:p>
+      <w:r>
+        <w:rPr>
+          <w:rFonts w:hint="eastAsia"/>
+        </w:rPr>
+        <w:t>G</w:t>
+      </w:r>
+      <w:r>
+        <w:t>enetic equilibrium means that P(Gchild) = P(Gparent) = P(Gmother) = q</w:t>
+      </w:r>
+    </w:p>
+    <w:p>
+      <w:r>
+        <w:t xml:space="preserve">Q = q + m – 2mq </w:t>
+      </w:r>
+    </w:p>
+    <w:p>
+      <w:pPr>
+        <w:rPr>
+          <w:rFonts w:hint="eastAsia"/>
+        </w:rPr>
+      </w:pPr>
+      <w:r>
+        <w:t>q</w:t>
+      </w:r>
+      <w:r>
+        <w:rPr>
+          <w:rFonts w:hint="eastAsia"/>
+        </w:rPr>
+        <w:t xml:space="preserve"> </w:t>
+      </w:r>
+      <w:r>
+        <w:t>= 0.5</w:t>
+      </w:r>
+    </w:p>
+    <w:p>
+      <w:r>
+        <w:rPr>
+          <w:rFonts w:hint="eastAsia"/>
+        </w:rPr>
+        <w:t>Ho</w:t>
+      </w:r>
+      <w:r>
+        <w:t>wever, w</w:t>
+      </w:r>
+      <w:r>
+        <w:t xml:space="preserve">e already know </w:t>
+      </w:r>
+      <w:r>
+        <w:t xml:space="preserve">that </w:t>
+      </w:r>
+      <w:r>
+        <w:t>most</w:t>
+      </w:r>
+      <w:r>
+        <w:rPr>
+          <w:rFonts w:hint="eastAsia"/>
+        </w:rPr>
+        <w:t xml:space="preserve"> people are accustomed to using the right hand instead of half using the right hand</w:t>
+      </w:r>
+      <w:r>
+        <w:t xml:space="preserve">, so the hypothesis at the beginning of this question must be wrong. </w:t>
+      </w:r>
+    </w:p>
+    <w:p>
+      <w:pPr>
+        <w:pStyle w:val="1"/>
+      </w:pPr>
+      <w:r>
+        <w:t>P</w:t>
+      </w:r>
+      <w:r>
+        <w:rPr>
+          <w:rFonts w:hint="eastAsia"/>
+        </w:rPr>
+        <w:t>roblem</w:t>
+      </w:r>
+      <w:r>
+        <w:t>3</w:t>
+      </w:r>
+    </w:p>
+    <w:p>
+      <w:r>
+        <w:rPr>
+          <w:rFonts w:hint="eastAsia"/>
+        </w:rPr>
+        <w:t>D</w:t>
+      </w:r>
+      <w:r>
+        <w:t>BN</w:t>
+      </w:r>
+    </w:p>
+    <w:p/>
+    <w:p>
+      <w:pPr>
+        <w:rPr>
+          <w:rFonts w:hint="eastAsia"/>
+        </w:rPr>
+      </w:pPr>
+    </w:p>
+    <w:tbl>
+      <w:tblPr>
+        <w:tblStyle w:val="a4"/>
+        <w:tblW w:w="0" w:type="auto"/>
+        <w:tblLook w:val="04A0" w:firstRow="1" w:lastRow="0" w:firstColumn="1" w:lastColumn="0" w:noHBand="0" w:noVBand="1"/>
+      </w:tblPr>
+      <w:tblGrid>
+        <w:gridCol w:w="1659"/>
+        <w:gridCol w:w="1659"/>
+        <w:gridCol w:w="1659"/>
+        <w:gridCol w:w="1659"/>
+        <w:gridCol w:w="1660"/>
+      </w:tblGrid>
+      <w:tr>
+        <w:tc>
+          <w:tcPr>
+            <w:tcW w:w="1659" w:type="dxa"/>
+          </w:tcPr>
+          <w:p/>
+        </w:tc>
+        <w:tc>
+          <w:tcPr>
+            <w:tcW w:w="1659" w:type="dxa"/>
+          </w:tcPr>
+          <w:p/>
+        </w:tc>
+        <w:tc>
+          <w:tcPr>
+            <w:tcW w:w="1659" w:type="dxa"/>
+          </w:tcPr>
+          <w:p/>
+        </w:tc>
+        <w:tc>
+          <w:tcPr>
+            <w:tcW w:w="1659" w:type="dxa"/>
+          </w:tcPr>
+          <w:p/>
+        </w:tc>
+        <w:tc>
+          <w:tcPr>
+            <w:tcW w:w="1660" w:type="dxa"/>
+          </w:tcPr>
+          <w:p/>
+        </w:tc>
+      </w:tr>
+      <w:tr>
+        <w:tc>
+          <w:tcPr>
+            <w:tcW w:w="1659" w:type="dxa"/>
+          </w:tcPr>
+          <w:p/>
+        </w:tc>
+        <w:tc>
+          <w:tcPr>
+            <w:tcW w:w="1659" w:type="dxa"/>
+          </w:tcPr>
+          <w:p/>
+        </w:tc>
+        <w:tc>
+          <w:tcPr>
+            <w:tcW w:w="1659" w:type="dxa"/>
+          </w:tcPr>
+          <w:p/>
+        </w:tc>
+        <w:tc>
+          <w:tcPr>
+            <w:tcW w:w="1659" w:type="dxa"/>
+          </w:tcPr>
+          <w:p/>
+        </w:tc>
+        <w:tc>
+          <w:tcPr>
+            <w:tcW w:w="1660" w:type="dxa"/>
+          </w:tcPr>
+          <w:p/>
+        </w:tc>
+      </w:tr>
+      <w:tr>
+        <w:tc>
+          <w:tcPr>
+            <w:tcW w:w="1659" w:type="dxa"/>
+          </w:tcPr>
+          <w:p/>
+        </w:tc>
+        <w:tc>
+          <w:tcPr>
+            <w:tcW w:w="1659" w:type="dxa"/>
+          </w:tcPr>
+          <w:p/>
+        </w:tc>
+        <w:tc>
+          <w:tcPr>
+            <w:tcW w:w="1659" w:type="dxa"/>
+          </w:tcPr>
+          <w:p/>
+        </w:tc>
+        <w:tc>
+          <w:tcPr>
+            <w:tcW w:w="1659" w:type="dxa"/>
+          </w:tcPr>
+          <w:p/>
+        </w:tc>
+        <w:tc>
+          <w:tcPr>
+            <w:tcW w:w="1660" w:type="dxa"/>
+          </w:tcPr>
+          <w:p/>
+        </w:tc>
+      </w:tr>
+      <w:tr>
+        <w:tc>
+          <w:tcPr>
+            <w:tcW w:w="1659" w:type="dxa"/>
+          </w:tcPr>
+          <w:p/>
+        </w:tc>
+        <w:tc>
+          <w:tcPr>
+            <w:tcW w:w="1659" w:type="dxa"/>
+          </w:tcPr>
+          <w:p/>
+        </w:tc>
+        <w:tc>
+          <w:tcPr>
+            <w:tcW w:w="1659" w:type="dxa"/>
+          </w:tcPr>
+          <w:p/>
+        </w:tc>
+        <w:tc>
+          <w:tcPr>
+            <w:tcW w:w="1659" w:type="dxa"/>
+          </w:tcPr>
+          <w:p/>
+        </w:tc>
+        <w:tc>
+          <w:tcPr>
+            <w:tcW w:w="1660" w:type="dxa"/>
+          </w:tcPr>
+          <w:p/>
+        </w:tc>
+      </w:tr>
+      <w:tr>
+        <w:tc>
+          <w:tcPr>
+            <w:tcW w:w="1659" w:type="dxa"/>
+          </w:tcPr>
+          <w:p/>
+        </w:tc>
+        <w:tc>
+          <w:tcPr>
+            <w:tcW w:w="1659" w:type="dxa"/>
+          </w:tcPr>
+          <w:p/>
+        </w:tc>
+        <w:tc>
+          <w:tcPr>
+            <w:tcW w:w="1659" w:type="dxa"/>
+          </w:tcPr>
+          <w:p/>
+        </w:tc>
+        <w:tc>
+          <w:tcPr>
+            <w:tcW w:w="1659" w:type="dxa"/>
+          </w:tcPr>
+          <w:p/>
+        </w:tc>
+        <w:tc>
+          <w:tcPr>
+            <w:tcW w:w="1660" w:type="dxa"/>
+          </w:tcPr>
+          <w:p/>
+        </w:tc>
+      </w:tr>
+      <w:tr>
+        <w:tc>
+          <w:tcPr>
+            <w:tcW w:w="1659" w:type="dxa"/>
+          </w:tcPr>
+          <w:p/>
+        </w:tc>
+        <w:tc>
+          <w:tcPr>
+            <w:tcW w:w="1659" w:type="dxa"/>
+          </w:tcPr>
+          <w:p/>
+        </w:tc>
+        <w:tc>
+          <w:tcPr>
+            <w:tcW w:w="1659" w:type="dxa"/>
+          </w:tcPr>
+          <w:p/>
+        </w:tc>
+        <w:tc>
+          <w:tcPr>
+            <w:tcW w:w="1659" w:type="dxa"/>
+          </w:tcPr>
+          <w:p/>
+        </w:tc>
+        <w:tc>
+          <w:tcPr>
+            <w:tcW w:w="1660" w:type="dxa"/>
+          </w:tcPr>
+          <w:p/>
+        </w:tc>
+      </w:tr>
+    </w:tbl>
+    <w:p/>
+    <w:p/>
+    <w:p>
+      <w:r>
+        <w:rPr>
+          <w:rFonts w:hint="eastAsia"/>
+        </w:rPr>
+        <w:t>H</w:t>
+      </w:r>
+      <w:r>
+        <w:t xml:space="preserve">MM </w:t>
+      </w:r>
+    </w:p>
+    <w:p>
+      <w:r>
+        <w:rPr>
+          <w:rFonts w:hint="eastAsia"/>
+        </w:rPr>
+        <w:t>只有一个随机变量.</w:t>
+      </w:r>
+      <w:r>
+        <w:t xml:space="preserve"> </w:t>
+      </w:r>
+      <w:r>
+        <w:rPr>
+          <w:rFonts w:hint="eastAsia"/>
+        </w:rPr>
+        <w:t>我们可以把DBN的所有状态变量合成成一个单一的状态变量,</w:t>
+      </w:r>
+      <w:r>
+        <w:t xml:space="preserve"> </w:t>
+      </w:r>
+      <w:r>
+        <w:rPr>
+          <w:rFonts w:hint="eastAsia"/>
+        </w:rPr>
+        <w:t>取值为单个状态变量所有可能的取值组成的元组.</w:t>
+      </w:r>
       <w:bookmarkStart w:id="0" w:name="_GoBack"/>
       <w:bookmarkEnd w:id="0"/>
+      <w:r>
+        <w:t xml:space="preserve"> </w:t>
+      </w:r>
+    </w:p>
+    <w:p/>
+    <w:p/>
+    <w:p/>
+    <w:p>
+      <w:pPr>
+        <w:rPr>
+          <w:rFonts w:hint="eastAsia"/>
+        </w:rPr>
+      </w:pPr>
     </w:p>
     <w:sectPr>
       <w:pgSz w:w="11906" w:h="16838"/>

</xml_diff>